<commit_message>
docs: regeneracion completa de formatos (docx + pdf via pandoc) en todos los proyectos (ciszu, ciszubot, ciszukoantony, ciszupy, muzicmania, ciszugamens) + public/docs sincronizados
</commit_message>
<xml_diff>
--- a/projects/ciszubot/docs/docx/ABOUT.docx
+++ b/projects/ciszubot/docs/docx/ABOUT.docx
@@ -102,121 +102,67 @@
       <w:r>
         <w:t xml:space="preserve">COMANDOS DISPONIBLES (12):</w:t>
       </w:r>
+      <w:r>
+        <w:t xml:space="preserve"> </w:t>
+      </w:r>
+      <w:r>
+        <w:t xml:space="preserve">- Información: help, profile, serverinfo</w:t>
+      </w:r>
+      <w:r>
+        <w:t xml:space="preserve"> </w:t>
+      </w:r>
+      <w:r>
+        <w:t xml:space="preserve">- Utilidad: ping, pong, test</w:t>
+      </w:r>
+      <w:r>
+        <w:t xml:space="preserve"> </w:t>
+      </w:r>
+      <w:r>
+        <w:t xml:space="preserve">- Diversión: say, directsay, confess, 8ball</w:t>
+      </w:r>
+      <w:r>
+        <w:t xml:space="preserve"> </w:t>
+      </w:r>
+      <w:r>
+        <w:t xml:space="preserve">- Social: hi, bye</w:t>
+      </w:r>
     </w:p>
     <w:p>
       <w:pPr>
-        <w:pStyle w:val="Compact"/>
-        <w:numPr>
-          <w:ilvl w:val="0"/>
-          <w:numId w:val="1001"/>
-        </w:numPr>
-      </w:pPr>
-      <w:r>
-        <w:t xml:space="preserve">Información: help, profile, serverinfo</w:t>
-      </w:r>
-    </w:p>
-    <w:p>
-      <w:pPr>
-        <w:pStyle w:val="Compact"/>
-        <w:numPr>
-          <w:ilvl w:val="0"/>
-          <w:numId w:val="1001"/>
-        </w:numPr>
-      </w:pPr>
-      <w:r>
-        <w:t xml:space="preserve">Utilidad: ping, pong, test</w:t>
-      </w:r>
-    </w:p>
-    <w:p>
-      <w:pPr>
-        <w:pStyle w:val="Compact"/>
-        <w:numPr>
-          <w:ilvl w:val="0"/>
-          <w:numId w:val="1001"/>
-        </w:numPr>
-      </w:pPr>
-      <w:r>
-        <w:t xml:space="preserve">Diversión: say, directsay, confess, 8ball</w:t>
-      </w:r>
-    </w:p>
-    <w:p>
-      <w:pPr>
-        <w:pStyle w:val="Compact"/>
-        <w:numPr>
-          <w:ilvl w:val="0"/>
-          <w:numId w:val="1001"/>
-        </w:numPr>
-      </w:pPr>
-      <w:r>
-        <w:t xml:space="preserve">Social: hi, bye</w:t>
-      </w:r>
-    </w:p>
-    <w:p>
-      <w:pPr>
-        <w:pStyle w:val="FirstParagraph"/>
+        <w:pStyle w:val="BodyText"/>
       </w:pPr>
       <w:r>
         <w:t xml:space="preserve">CARACTERÍSTICAS:</w:t>
       </w:r>
-    </w:p>
-    <w:p>
-      <w:pPr>
-        <w:pStyle w:val="Compact"/>
-        <w:numPr>
-          <w:ilvl w:val="0"/>
-          <w:numId w:val="1002"/>
-        </w:numPr>
-      </w:pPr>
-      <w:r>
-        <w:t xml:space="preserve">Prefijo: cz! (configurable)</w:t>
-      </w:r>
-    </w:p>
-    <w:p>
-      <w:pPr>
-        <w:pStyle w:val="Compact"/>
-        <w:numPr>
-          <w:ilvl w:val="0"/>
-          <w:numId w:val="1002"/>
-        </w:numPr>
-      </w:pPr>
-      <w:r>
-        <w:t xml:space="preserve">Slash commands: Todos los comandos disponibles como /comando</w:t>
-      </w:r>
-    </w:p>
-    <w:p>
-      <w:pPr>
-        <w:pStyle w:val="Compact"/>
-        <w:numPr>
-          <w:ilvl w:val="0"/>
-          <w:numId w:val="1002"/>
-        </w:numPr>
-      </w:pPr>
-      <w:r>
-        <w:t xml:space="preserve">Embeds con paleta de colores índigo y violeta</w:t>
-      </w:r>
-    </w:p>
-    <w:p>
-      <w:pPr>
-        <w:pStyle w:val="Compact"/>
-        <w:numPr>
-          <w:ilvl w:val="0"/>
-          <w:numId w:val="1002"/>
-        </w:numPr>
-      </w:pPr>
-      <w:r>
-        <w:t xml:space="preserve">Panel de administración Express con estadísticas en vivo</w:t>
-      </w:r>
-    </w:p>
-    <w:p>
-      <w:pPr>
-        <w:pStyle w:val="Compact"/>
-        <w:numPr>
-          <w:ilvl w:val="0"/>
-          <w:numId w:val="1002"/>
-        </w:numPr>
-      </w:pPr>
-      <w:r>
-        <w:t xml:space="preserve">Logging a consola y archivo</w:t>
+      <w:r>
+        <w:t xml:space="preserve"> </w:t>
+      </w:r>
+      <w:r>
+        <w:t xml:space="preserve">- Prefijo: cz! (configurable)</w:t>
+      </w:r>
+      <w:r>
+        <w:t xml:space="preserve"> </w:t>
+      </w:r>
+      <w:r>
+        <w:t xml:space="preserve">- Slash commands: Todos los comandos disponibles como /comando</w:t>
+      </w:r>
+      <w:r>
+        <w:t xml:space="preserve"> </w:t>
+      </w:r>
+      <w:r>
+        <w:t xml:space="preserve">- Embeds con paleta de colores índigo y violeta</w:t>
+      </w:r>
+      <w:r>
+        <w:t xml:space="preserve"> </w:t>
+      </w:r>
+      <w:r>
+        <w:t xml:space="preserve">- Panel de administración Express con estadísticas en vivo</w:t>
+      </w:r>
+      <w:r>
+        <w:t xml:space="preserve"> </w:t>
+      </w:r>
+      <w:r>
+        <w:t xml:space="preserve">- Logging a consola y archivo</w:t>
       </w:r>
     </w:p>
     <w:p>
@@ -273,121 +219,67 @@
       <w:r>
         <w:t xml:space="preserve">AVAILABLE COMMANDS (12):</w:t>
       </w:r>
+      <w:r>
+        <w:t xml:space="preserve"> </w:t>
+      </w:r>
+      <w:r>
+        <w:t xml:space="preserve">- Information: help, profile, serverinfo</w:t>
+      </w:r>
+      <w:r>
+        <w:t xml:space="preserve"> </w:t>
+      </w:r>
+      <w:r>
+        <w:t xml:space="preserve">- Utility: ping, pong, test</w:t>
+      </w:r>
+      <w:r>
+        <w:t xml:space="preserve"> </w:t>
+      </w:r>
+      <w:r>
+        <w:t xml:space="preserve">- Fun: say, directsay, confess, 8ball</w:t>
+      </w:r>
+      <w:r>
+        <w:t xml:space="preserve"> </w:t>
+      </w:r>
+      <w:r>
+        <w:t xml:space="preserve">- Social: hi, bye</w:t>
+      </w:r>
     </w:p>
     <w:p>
       <w:pPr>
-        <w:pStyle w:val="Compact"/>
-        <w:numPr>
-          <w:ilvl w:val="0"/>
-          <w:numId w:val="1003"/>
-        </w:numPr>
-      </w:pPr>
-      <w:r>
-        <w:t xml:space="preserve">Information: help, profile, serverinfo</w:t>
-      </w:r>
-    </w:p>
-    <w:p>
-      <w:pPr>
-        <w:pStyle w:val="Compact"/>
-        <w:numPr>
-          <w:ilvl w:val="0"/>
-          <w:numId w:val="1003"/>
-        </w:numPr>
-      </w:pPr>
-      <w:r>
-        <w:t xml:space="preserve">Utility: ping, pong, test</w:t>
-      </w:r>
-    </w:p>
-    <w:p>
-      <w:pPr>
-        <w:pStyle w:val="Compact"/>
-        <w:numPr>
-          <w:ilvl w:val="0"/>
-          <w:numId w:val="1003"/>
-        </w:numPr>
-      </w:pPr>
-      <w:r>
-        <w:t xml:space="preserve">Fun: say, directsay, confess, 8ball</w:t>
-      </w:r>
-    </w:p>
-    <w:p>
-      <w:pPr>
-        <w:pStyle w:val="Compact"/>
-        <w:numPr>
-          <w:ilvl w:val="0"/>
-          <w:numId w:val="1003"/>
-        </w:numPr>
-      </w:pPr>
-      <w:r>
-        <w:t xml:space="preserve">Social: hi, bye</w:t>
-      </w:r>
-    </w:p>
-    <w:p>
-      <w:pPr>
-        <w:pStyle w:val="FirstParagraph"/>
+        <w:pStyle w:val="BodyText"/>
       </w:pPr>
       <w:r>
         <w:t xml:space="preserve">FEATURES:</w:t>
       </w:r>
-    </w:p>
-    <w:p>
-      <w:pPr>
-        <w:pStyle w:val="Compact"/>
-        <w:numPr>
-          <w:ilvl w:val="0"/>
-          <w:numId w:val="1004"/>
-        </w:numPr>
-      </w:pPr>
-      <w:r>
-        <w:t xml:space="preserve">Prefix: cz! (configurable)</w:t>
-      </w:r>
-    </w:p>
-    <w:p>
-      <w:pPr>
-        <w:pStyle w:val="Compact"/>
-        <w:numPr>
-          <w:ilvl w:val="0"/>
-          <w:numId w:val="1004"/>
-        </w:numPr>
-      </w:pPr>
-      <w:r>
-        <w:t xml:space="preserve">Slash commands: All commands available as /command</w:t>
-      </w:r>
-    </w:p>
-    <w:p>
-      <w:pPr>
-        <w:pStyle w:val="Compact"/>
-        <w:numPr>
-          <w:ilvl w:val="0"/>
-          <w:numId w:val="1004"/>
-        </w:numPr>
-      </w:pPr>
-      <w:r>
-        <w:t xml:space="preserve">Embeds with indigo and violet color palette</w:t>
-      </w:r>
-    </w:p>
-    <w:p>
-      <w:pPr>
-        <w:pStyle w:val="Compact"/>
-        <w:numPr>
-          <w:ilvl w:val="0"/>
-          <w:numId w:val="1004"/>
-        </w:numPr>
-      </w:pPr>
-      <w:r>
-        <w:t xml:space="preserve">Express admin panel with live statistics</w:t>
-      </w:r>
-    </w:p>
-    <w:p>
-      <w:pPr>
-        <w:pStyle w:val="Compact"/>
-        <w:numPr>
-          <w:ilvl w:val="0"/>
-          <w:numId w:val="1004"/>
-        </w:numPr>
-      </w:pPr>
-      <w:r>
-        <w:t xml:space="preserve">Console and file logging</w:t>
+      <w:r>
+        <w:t xml:space="preserve"> </w:t>
+      </w:r>
+      <w:r>
+        <w:t xml:space="preserve">- Prefix: cz! (configurable)</w:t>
+      </w:r>
+      <w:r>
+        <w:t xml:space="preserve"> </w:t>
+      </w:r>
+      <w:r>
+        <w:t xml:space="preserve">- Slash commands: All commands available as /command</w:t>
+      </w:r>
+      <w:r>
+        <w:t xml:space="preserve"> </w:t>
+      </w:r>
+      <w:r>
+        <w:t xml:space="preserve">- Embeds with indigo and violet color palette</w:t>
+      </w:r>
+      <w:r>
+        <w:t xml:space="preserve"> </w:t>
+      </w:r>
+      <w:r>
+        <w:t xml:space="preserve">- Express admin panel with live statistics</w:t>
+      </w:r>
+      <w:r>
+        <w:t xml:space="preserve"> </w:t>
+      </w:r>
+      <w:r>
+        <w:t xml:space="preserve">- Console and file logging</w:t>
       </w:r>
     </w:p>
     <w:sectPr>
@@ -500,123 +392,8 @@
       </w:pPr>
     </w:lvl>
   </w:abstractNum>
-  <w:abstractNum w:abstractNumId="991">
-    <w:nsid w:val="0000A991"/>
-    <w:multiLevelType w:val="multilevel"/>
-    <w:lvl w:ilvl="0">
-      <w:numFmt w:val="bullet"/>
-      <w:lvlText w:val=""/>
-      <w:lvlJc w:val="left"/>
-      <w:pPr>
-        <w:ind w:left="720" w:hanging="360"/>
-      </w:pPr>
-      <w:rPr>
-        <w:rFonts w:ascii="Symbol" w:hAnsi="Symbol" w:cs="Symbol" w:hint="default"/>
-      </w:rPr>
-    </w:lvl>
-    <w:lvl w:ilvl="1">
-      <w:numFmt w:val="bullet"/>
-      <w:lvlText w:val="o"/>
-      <w:lvlJc w:val="left"/>
-      <w:pPr>
-        <w:ind w:left="1440" w:hanging="360"/>
-      </w:pPr>
-      <w:rPr>
-        <w:rFonts w:ascii="Courier New" w:hAnsi="Courier New" w:cs="Courier New" w:hint="default"/>
-      </w:rPr>
-    </w:lvl>
-    <w:lvl w:ilvl="2">
-      <w:numFmt w:val="bullet"/>
-      <w:lvlText w:val=""/>
-      <w:lvlJc w:val="left"/>
-      <w:pPr>
-        <w:ind w:left="2160" w:hanging="360"/>
-      </w:pPr>
-      <w:rPr>
-        <w:rFonts w:ascii="Wingdings" w:hAnsi="Wingdings" w:cs="Wingdings" w:hint="default"/>
-      </w:rPr>
-    </w:lvl>
-    <w:lvl w:ilvl="3">
-      <w:numFmt w:val="bullet"/>
-      <w:lvlText w:val=""/>
-      <w:lvlJc w:val="left"/>
-      <w:pPr>
-        <w:ind w:left="2880" w:hanging="360"/>
-      </w:pPr>
-      <w:rPr>
-        <w:rFonts w:ascii="Symbol" w:hAnsi="Symbol" w:cs="Symbol" w:hint="default"/>
-      </w:rPr>
-    </w:lvl>
-    <w:lvl w:ilvl="4">
-      <w:numFmt w:val="bullet"/>
-      <w:lvlText w:val="o"/>
-      <w:lvlJc w:val="left"/>
-      <w:pPr>
-        <w:ind w:left="3600" w:hanging="360"/>
-      </w:pPr>
-      <w:rPr>
-        <w:rFonts w:ascii="Courier New" w:hAnsi="Courier New" w:cs="Courier New" w:hint="default"/>
-      </w:rPr>
-    </w:lvl>
-    <w:lvl w:ilvl="5">
-      <w:numFmt w:val="bullet"/>
-      <w:lvlText w:val=""/>
-      <w:lvlJc w:val="left"/>
-      <w:pPr>
-        <w:ind w:left="4320" w:hanging="360"/>
-      </w:pPr>
-      <w:rPr>
-        <w:rFonts w:ascii="Wingdings" w:hAnsi="Wingdings" w:cs="Wingdings" w:hint="default"/>
-      </w:rPr>
-    </w:lvl>
-    <w:lvl w:ilvl="6">
-      <w:numFmt w:val="bullet"/>
-      <w:lvlText w:val=""/>
-      <w:lvlJc w:val="left"/>
-      <w:pPr>
-        <w:ind w:left="5040" w:hanging="360"/>
-      </w:pPr>
-      <w:rPr>
-        <w:rFonts w:ascii="Symbol" w:hAnsi="Symbol" w:cs="Symbol" w:hint="default"/>
-      </w:rPr>
-    </w:lvl>
-    <w:lvl w:ilvl="7">
-      <w:numFmt w:val="bullet"/>
-      <w:lvlText w:val="o"/>
-      <w:lvlJc w:val="left"/>
-      <w:pPr>
-        <w:ind w:left="5760" w:hanging="360"/>
-      </w:pPr>
-      <w:rPr>
-        <w:rFonts w:ascii="Courier New" w:hAnsi="Courier New" w:cs="Courier New" w:hint="default"/>
-      </w:rPr>
-    </w:lvl>
-    <w:lvl w:ilvl="8">
-      <w:numFmt w:val="bullet"/>
-      <w:lvlText w:val=""/>
-      <w:lvlJc w:val="left"/>
-      <w:pPr>
-        <w:ind w:left="6480" w:hanging="360"/>
-      </w:pPr>
-      <w:rPr>
-        <w:rFonts w:ascii="Wingdings" w:hAnsi="Wingdings" w:cs="Wingdings" w:hint="default"/>
-      </w:rPr>
-    </w:lvl>
-  </w:abstractNum>
   <w:num w:numId="1000">
     <w:abstractNumId w:val="990"/>
-  </w:num>
-  <w:num w:numId="1001">
-    <w:abstractNumId w:val="991"/>
-  </w:num>
-  <w:num w:numId="1002">
-    <w:abstractNumId w:val="991"/>
-  </w:num>
-  <w:num w:numId="1003">
-    <w:abstractNumId w:val="991"/>
-  </w:num>
-  <w:num w:numId="1004">
-    <w:abstractNumId w:val="991"/>
   </w:num>
 </w:numbering>
 </file>

</xml_diff>